<commit_message>
Adiciona evidência real do board Jira na Atividade 13
Print do board do Jira (betosilva.atlassian.net) com os 5 defeitos
registrados, distribuídos nas colunas certas e com as etiquetas de
severidade/prioridade aplicadas, embutido na seção de evidência do doc.

Co-Authored-By: Claude Sonnet 5 <noreply@anthropic.com>
Claude-Session: https://claude.ai/code/session_018BLEsdhLyv9pz4Sfwa1pJ4
</commit_message>
<xml_diff>
--- a/garantia-qualidade-software/atividade-13/Atividade13_Bug_Tracking_Jira.docx
+++ b/garantia-qualidade-software/atividade-13/Atividade13_Bug_Tracking_Jira.docx
@@ -247,7 +247,7 @@
           <w:i w:val="0"/>
           <w:sz w:val="21"/>
         </w:rPr>
-        <w:t>Projeto Jira: spring-petclinic-qa.atlassian.net (template Kanban)</w:t>
+        <w:t>Projeto Jira: betosilva.atlassian.net (template Kanban, plano Free)</w:t>
       </w:r>
     </w:p>
     <w:p>
@@ -2748,7 +2748,7 @@
                 <w:i w:val="0"/>
                 <w:sz w:val="20"/>
               </w:rPr>
-              <w:t>Backlog</w:t>
+              <w:t>Novo</w:t>
             </w:r>
           </w:p>
         </w:tc>
@@ -2960,7 +2960,7 @@
                 <w:i w:val="0"/>
                 <w:sz w:val="20"/>
               </w:rPr>
-              <w:t>Concluído</w:t>
+              <w:t>Fechado</w:t>
             </w:r>
           </w:p>
         </w:tc>
@@ -3010,14 +3010,53 @@
         <w:rPr>
           <w:rFonts w:ascii="Calibri" w:hAnsi="Calibri"/>
           <w:b w:val="0"/>
-          <w:i/>
+          <w:i w:val="0"/>
           <w:sz w:val="21"/>
         </w:rPr>
-        <w:t>[print do board do Jira com os 5 cartões distribuídos nas colunas acima]</w:t>
+        <w:t>Print do board do Jira (betosilva.atlassian.net) com os 5 defeitos registrados, já com severidade, prioridade e coluna atribuídas conforme a triagem.</w:t>
+      </w:r>
+    </w:p>
+    <w:p>
+      <w:pPr>
+        <w:jc w:val="center"/>
+      </w:pPr>
+      <w:r>
+        <w:drawing>
+          <wp:inline xmlns:a="http://schemas.openxmlformats.org/drawingml/2006/main" xmlns:pic="http://schemas.openxmlformats.org/drawingml/2006/picture">
+            <wp:extent cx="5760720" cy="3315294"/>
+            <wp:docPr id="3" name="Picture 3"/>
+            <wp:cNvGraphicFramePr>
+              <a:graphicFrameLocks noChangeAspect="1"/>
+            </wp:cNvGraphicFramePr>
+            <a:graphic>
+              <a:graphicData uri="http://schemas.openxmlformats.org/drawingml/2006/picture">
+                <pic:pic>
+                  <pic:nvPicPr>
+                    <pic:cNvPr id="0" name="board-jira-5-bugs.png"/>
+                    <pic:cNvPicPr/>
+                  </pic:nvPicPr>
+                  <pic:blipFill>
+                    <a:blip r:embed="rId11"/>
+                    <a:stretch>
+                      <a:fillRect/>
+                    </a:stretch>
+                  </pic:blipFill>
+                  <pic:spPr>
+                    <a:xfrm>
+                      <a:off x="0" y="0"/>
+                      <a:ext cx="5760720" cy="3315294"/>
+                    </a:xfrm>
+                    <a:prstGeom prst="rect"/>
+                  </pic:spPr>
+                </pic:pic>
+              </a:graphicData>
+            </a:graphic>
+          </wp:inline>
+        </w:drawing>
       </w:r>
     </w:p>
     <w:sectPr>
-      <w:footerReference w:type="default" r:id="rId11"/>
+      <w:footerReference w:type="default" r:id="rId12"/>
       <w:pgSz w:w="12240" w:h="15840"/>
       <w:pgMar w:top="850" w:right="1134" w:bottom="850" w:left="1134" w:header="720" w:footer="720" w:gutter="0"/>
       <w:cols w:space="720"/>

</xml_diff>

<commit_message>
Corrige Atividades 13 e 14 para usar os defeitos reais do Armando (AT12)
Os 5 bugs usados nas Atividades 13 (Jira) e 14 (Triagem) eram fictícios
e não batiam com o relatório oficial de Bug Hunt entregue pelo Armando.
Substituídos pelos 5 defeitos reais (CEP aceita letra, checkout com
carrinho vazio, imagem igual em todos produtos, descrição ausente,
preços/layout inconsistentes), com severidade/prioridade e distribuição
no board recalculadas de acordo. Também anexa o PDF oficial da
Atividade 12 como arquivo final, substituindo o rascunho fictício.

Co-Authored-By: Claude Sonnet 5 <noreply@anthropic.com>
Claude-Session: https://claude.ai/code/session_018BLEsdhLyv9pz4Sfwa1pJ4
</commit_message>
<xml_diff>
--- a/garantia-qualidade-software/atividade-13/Atividade13_Bug_Tracking_Jira.docx
+++ b/garantia-qualidade-software/atividade-13/Atividade13_Bug_Tracking_Jira.docx
@@ -911,7 +911,7 @@
           <w:i w:val="0"/>
           <w:sz w:val="23"/>
         </w:rPr>
-        <w:t>[BUG-003] Campo "Last Name" não aceita digitação na tela de Checkout</w:t>
+        <w:t>[BUG-002] Checkout pode ser concluído com carrinho vazio</w:t>
       </w:r>
     </w:p>
     <w:tbl>
@@ -963,369 +963,6 @@
                 <w:sz w:val="20"/>
               </w:rPr>
               <w:t>Em Correção</w:t>
-            </w:r>
-          </w:p>
-        </w:tc>
-      </w:tr>
-      <w:tr>
-        <w:tc>
-          <w:tcPr>
-            <w:tcW w:type="dxa" w:w="2304"/>
-            <w:shd w:val="clear" w:color="auto" w:fill="E7E6E6"/>
-          </w:tcPr>
-          <w:p>
-            <w:r>
-              <w:rPr>
-                <w:rFonts w:ascii="Calibri" w:hAnsi="Calibri"/>
-                <w:b/>
-                <w:i w:val="0"/>
-                <w:sz w:val="20"/>
-              </w:rPr>
-              <w:t>Etiqueta Severidade</w:t>
-            </w:r>
-          </w:p>
-        </w:tc>
-        <w:tc>
-          <w:tcPr>
-            <w:tcW w:type="dxa" w:w="6912"/>
-          </w:tcPr>
-          <w:p>
-            <w:r>
-              <w:rPr>
-                <w:rFonts w:ascii="Calibri" w:hAnsi="Calibri"/>
-                <w:b w:val="0"/>
-                <w:i w:val="0"/>
-                <w:sz w:val="20"/>
-              </w:rPr>
-              <w:t>Vermelho (Crítica)</w:t>
-            </w:r>
-          </w:p>
-        </w:tc>
-      </w:tr>
-      <w:tr>
-        <w:tc>
-          <w:tcPr>
-            <w:tcW w:type="dxa" w:w="2304"/>
-            <w:shd w:val="clear" w:color="auto" w:fill="E7E6E6"/>
-          </w:tcPr>
-          <w:p>
-            <w:r>
-              <w:rPr>
-                <w:rFonts w:ascii="Calibri" w:hAnsi="Calibri"/>
-                <w:b/>
-                <w:i w:val="0"/>
-                <w:sz w:val="20"/>
-              </w:rPr>
-              <w:t>Etiqueta Prioridade</w:t>
-            </w:r>
-          </w:p>
-        </w:tc>
-        <w:tc>
-          <w:tcPr>
-            <w:tcW w:type="dxa" w:w="6912"/>
-          </w:tcPr>
-          <w:p>
-            <w:r>
-              <w:rPr>
-                <w:rFonts w:ascii="Calibri" w:hAnsi="Calibri"/>
-                <w:b w:val="0"/>
-                <w:i w:val="0"/>
-                <w:sz w:val="20"/>
-              </w:rPr>
-              <w:t>Roxo (Alta)</w:t>
-            </w:r>
-          </w:p>
-        </w:tc>
-      </w:tr>
-      <w:tr>
-        <w:tc>
-          <w:tcPr>
-            <w:tcW w:type="dxa" w:w="2304"/>
-            <w:shd w:val="clear" w:color="auto" w:fill="E7E6E6"/>
-          </w:tcPr>
-          <w:p>
-            <w:r>
-              <w:rPr>
-                <w:rFonts w:ascii="Calibri" w:hAnsi="Calibri"/>
-                <w:b/>
-                <w:i w:val="0"/>
-                <w:sz w:val="20"/>
-              </w:rPr>
-              <w:t>Ambiente</w:t>
-            </w:r>
-          </w:p>
-        </w:tc>
-        <w:tc>
-          <w:tcPr>
-            <w:tcW w:type="dxa" w:w="6912"/>
-          </w:tcPr>
-          <w:p>
-            <w:r>
-              <w:rPr>
-                <w:rFonts w:ascii="Calibri" w:hAnsi="Calibri"/>
-                <w:b w:val="0"/>
-                <w:i w:val="0"/>
-                <w:sz w:val="20"/>
-              </w:rPr>
-              <w:t>Windows 11, Chrome 128</w:t>
-            </w:r>
-          </w:p>
-        </w:tc>
-      </w:tr>
-      <w:tr>
-        <w:tc>
-          <w:tcPr>
-            <w:tcW w:type="dxa" w:w="2304"/>
-            <w:shd w:val="clear" w:color="auto" w:fill="E7E6E6"/>
-          </w:tcPr>
-          <w:p>
-            <w:r>
-              <w:rPr>
-                <w:rFonts w:ascii="Calibri" w:hAnsi="Calibri"/>
-                <w:b/>
-                <w:i w:val="0"/>
-                <w:sz w:val="20"/>
-              </w:rPr>
-              <w:t>Pré-condição</w:t>
-            </w:r>
-          </w:p>
-        </w:tc>
-        <w:tc>
-          <w:tcPr>
-            <w:tcW w:type="dxa" w:w="6912"/>
-          </w:tcPr>
-          <w:p>
-            <w:r>
-              <w:rPr>
-                <w:rFonts w:ascii="Calibri" w:hAnsi="Calibri"/>
-                <w:b w:val="0"/>
-                <w:i w:val="0"/>
-                <w:sz w:val="20"/>
-              </w:rPr>
-              <w:t>Login com error_user, carrinho com 1 item, tela Checkout: Your Information</w:t>
-            </w:r>
-          </w:p>
-        </w:tc>
-      </w:tr>
-      <w:tr>
-        <w:tc>
-          <w:tcPr>
-            <w:tcW w:type="dxa" w:w="2304"/>
-            <w:shd w:val="clear" w:color="auto" w:fill="E7E6E6"/>
-          </w:tcPr>
-          <w:p>
-            <w:r>
-              <w:rPr>
-                <w:rFonts w:ascii="Calibri" w:hAnsi="Calibri"/>
-                <w:b/>
-                <w:i w:val="0"/>
-                <w:sz w:val="20"/>
-              </w:rPr>
-              <w:t>Passos para Reprodução</w:t>
-            </w:r>
-          </w:p>
-        </w:tc>
-        <w:tc>
-          <w:tcPr>
-            <w:tcW w:type="dxa" w:w="6912"/>
-          </w:tcPr>
-          <w:p>
-            <w:r/>
-            <w:r>
-              <w:rPr>
-                <w:rFonts w:ascii="Calibri" w:hAnsi="Calibri"/>
-                <w:b w:val="0"/>
-                <w:i w:val="0"/>
-                <w:sz w:val="20"/>
-              </w:rPr>
-              <w:t>1. Login com error_user.</w:t>
-            </w:r>
-          </w:p>
-          <w:p>
-            <w:r>
-              <w:rPr>
-                <w:rFonts w:ascii="Calibri" w:hAnsi="Calibri"/>
-                <w:b w:val="0"/>
-                <w:i w:val="0"/>
-                <w:sz w:val="20"/>
-              </w:rPr>
-              <w:t>2. Add to cart em qualquer item.</w:t>
-            </w:r>
-          </w:p>
-          <w:p>
-            <w:r>
-              <w:rPr>
-                <w:rFonts w:ascii="Calibri" w:hAnsi="Calibri"/>
-                <w:b w:val="0"/>
-                <w:i w:val="0"/>
-                <w:sz w:val="20"/>
-              </w:rPr>
-              <w:t>3. Ir para o carrinho e clicar em Checkout.</w:t>
-            </w:r>
-          </w:p>
-          <w:p>
-            <w:r>
-              <w:rPr>
-                <w:rFonts w:ascii="Calibri" w:hAnsi="Calibri"/>
-                <w:b w:val="0"/>
-                <w:i w:val="0"/>
-                <w:sz w:val="20"/>
-              </w:rPr>
-              <w:t>4. Preencher First Name.</w:t>
-            </w:r>
-          </w:p>
-          <w:p>
-            <w:r>
-              <w:rPr>
-                <w:rFonts w:ascii="Calibri" w:hAnsi="Calibri"/>
-                <w:b w:val="0"/>
-                <w:i w:val="0"/>
-                <w:sz w:val="20"/>
-              </w:rPr>
-              <w:t>5. Clicar no campo Last Name e tentar digitar.</w:t>
-            </w:r>
-          </w:p>
-        </w:tc>
-      </w:tr>
-      <w:tr>
-        <w:tc>
-          <w:tcPr>
-            <w:tcW w:type="dxa" w:w="2304"/>
-            <w:shd w:val="clear" w:color="auto" w:fill="E7E6E6"/>
-          </w:tcPr>
-          <w:p>
-            <w:r>
-              <w:rPr>
-                <w:rFonts w:ascii="Calibri" w:hAnsi="Calibri"/>
-                <w:b/>
-                <w:i w:val="0"/>
-                <w:sz w:val="20"/>
-              </w:rPr>
-              <w:t>Resultado Esperado</w:t>
-            </w:r>
-          </w:p>
-        </w:tc>
-        <w:tc>
-          <w:tcPr>
-            <w:tcW w:type="dxa" w:w="6912"/>
-          </w:tcPr>
-          <w:p>
-            <w:r>
-              <w:rPr>
-                <w:rFonts w:ascii="Calibri" w:hAnsi="Calibri"/>
-                <w:b w:val="0"/>
-                <w:i w:val="0"/>
-                <w:sz w:val="20"/>
-              </w:rPr>
-              <w:t>Campo deveria aceitar o texto normalmente</w:t>
-            </w:r>
-          </w:p>
-        </w:tc>
-      </w:tr>
-      <w:tr>
-        <w:tc>
-          <w:tcPr>
-            <w:tcW w:type="dxa" w:w="2304"/>
-            <w:shd w:val="clear" w:color="auto" w:fill="E7E6E6"/>
-          </w:tcPr>
-          <w:p>
-            <w:r>
-              <w:rPr>
-                <w:rFonts w:ascii="Calibri" w:hAnsi="Calibri"/>
-                <w:b/>
-                <w:i w:val="0"/>
-                <w:sz w:val="20"/>
-              </w:rPr>
-              <w:t>Resultado Obtido</w:t>
-            </w:r>
-          </w:p>
-        </w:tc>
-        <w:tc>
-          <w:tcPr>
-            <w:tcW w:type="dxa" w:w="6912"/>
-          </w:tcPr>
-          <w:p>
-            <w:r>
-              <w:rPr>
-                <w:rFonts w:ascii="Calibri" w:hAnsi="Calibri"/>
-                <w:b w:val="0"/>
-                <w:i w:val="0"/>
-                <w:sz w:val="20"/>
-              </w:rPr>
-              <w:t>Campo não responde à digitação, bloqueia 100% do fluxo de compra para essa conta</w:t>
-            </w:r>
-          </w:p>
-        </w:tc>
-      </w:tr>
-    </w:tbl>
-    <w:p>
-      <w:pPr>
-        <w:spacing w:after="120"/>
-      </w:pPr>
-    </w:p>
-    <w:p>
-      <w:pPr>
-        <w:spacing w:before="200" w:after="80"/>
-      </w:pPr>
-      <w:r>
-        <w:rPr>
-          <w:rFonts w:ascii="Calibri" w:hAnsi="Calibri"/>
-          <w:b/>
-          <w:i w:val="0"/>
-          <w:sz w:val="23"/>
-        </w:rPr>
-        <w:t>[BUG-001] "Imagens dos produtos trocadas" — todos os itens com a mesma foto</w:t>
-      </w:r>
-    </w:p>
-    <w:tbl>
-      <w:tblPr>
-        <w:tblW w:type="auto" w:w="0"/>
-        <w:jc w:val="center"/>
-        <w:tblLook w:firstColumn="1" w:firstRow="1" w:lastColumn="0" w:lastRow="0" w:noHBand="0" w:noVBand="1" w:val="04A0"/>
-        <w:tblBorders>
-          <w:top w:val="single" w:sz="4" w:space="0" w:color="BFBFBF"/>
-          <w:left w:val="single" w:sz="4" w:space="0" w:color="BFBFBF"/>
-          <w:bottom w:val="single" w:sz="4" w:space="0" w:color="BFBFBF"/>
-          <w:right w:val="single" w:sz="4" w:space="0" w:color="BFBFBF"/>
-          <w:insideH w:val="single" w:sz="4" w:space="0" w:color="BFBFBF"/>
-          <w:insideV w:val="single" w:sz="4" w:space="0" w:color="BFBFBF"/>
-        </w:tblBorders>
-      </w:tblPr>
-      <w:tblGrid>
-        <w:gridCol w:w="4986"/>
-        <w:gridCol w:w="4986"/>
-      </w:tblGrid>
-      <w:tr>
-        <w:tc>
-          <w:tcPr>
-            <w:tcW w:type="dxa" w:w="2304"/>
-            <w:shd w:val="clear" w:color="auto" w:fill="E7E6E6"/>
-          </w:tcPr>
-          <w:p>
-            <w:r>
-              <w:rPr>
-                <w:rFonts w:ascii="Calibri" w:hAnsi="Calibri"/>
-                <w:b/>
-                <w:i w:val="0"/>
-                <w:sz w:val="20"/>
-              </w:rPr>
-              <w:t>Lista atual</w:t>
-            </w:r>
-          </w:p>
-        </w:tc>
-        <w:tc>
-          <w:tcPr>
-            <w:tcW w:type="dxa" w:w="6912"/>
-          </w:tcPr>
-          <w:p>
-            <w:r>
-              <w:rPr>
-                <w:rFonts w:ascii="Calibri" w:hAnsi="Calibri"/>
-                <w:b w:val="0"/>
-                <w:i w:val="0"/>
-                <w:sz w:val="20"/>
-              </w:rPr>
-              <w:t>Em Análise</w:t>
             </w:r>
           </w:p>
         </w:tc>
@@ -1430,7 +1067,7 @@
                 <w:i w:val="0"/>
                 <w:sz w:val="20"/>
               </w:rPr>
-              <w:t>Windows 11, Chrome 128</w:t>
+              <w:t>Sauce Demo / Google Chrome / Windows</w:t>
             </w:r>
           </w:p>
         </w:tc>
@@ -1465,7 +1102,7 @@
                 <w:i w:val="0"/>
                 <w:sz w:val="20"/>
               </w:rPr>
-              <w:t>Login com problem_user</w:t>
+              <w:t>Usuário autenticado com standard_user; carrinho sem itens</w:t>
             </w:r>
           </w:p>
         </w:tc>
@@ -1501,7 +1138,7 @@
                 <w:i w:val="0"/>
                 <w:sz w:val="20"/>
               </w:rPr>
-              <w:t>1. Login com problem_user.</w:t>
+              <w:t>1. Abrir o carrinho sem adicionar nenhum produto.</w:t>
             </w:r>
           </w:p>
           <w:p>
@@ -1512,7 +1149,7 @@
                 <w:i w:val="0"/>
                 <w:sz w:val="20"/>
               </w:rPr>
-              <w:t>2. Entrar em Products.</w:t>
+              <w:t>2. Clicar em Checkout.</w:t>
             </w:r>
           </w:p>
           <w:p>
@@ -1523,7 +1160,18 @@
                 <w:i w:val="0"/>
                 <w:sz w:val="20"/>
               </w:rPr>
-              <w:t>3. Olhar a foto de cada produto.</w:t>
+              <w:t>3. Preencher nome, sobrenome e CEP e clicar em Continue.</w:t>
+            </w:r>
+          </w:p>
+          <w:p>
+            <w:r>
+              <w:rPr>
+                <w:rFonts w:ascii="Calibri" w:hAnsi="Calibri"/>
+                <w:b w:val="0"/>
+                <w:i w:val="0"/>
+                <w:sz w:val="20"/>
+              </w:rPr>
+              <w:t>4. Na tela de resumo (Total $0.00), clicar em Finish.</w:t>
             </w:r>
           </w:p>
         </w:tc>
@@ -1558,7 +1206,7 @@
                 <w:i w:val="0"/>
                 <w:sz w:val="20"/>
               </w:rPr>
-              <w:t>Cada produto com a foto correta</w:t>
+              <w:t>O sistema deveria impedir o início ou a finalização do checkout com o carrinho vazio</w:t>
             </w:r>
           </w:p>
         </w:tc>
@@ -1593,7 +1241,7 @@
                 <w:i w:val="0"/>
                 <w:sz w:val="20"/>
               </w:rPr>
-              <w:t>Todos os 6 produtos com a mesma imagem (cachorro)</w:t>
+              <w:t>O sistema permitiu avançar com Item total $0, Tax $0.00 e Total $0.00 e exibiu a tela Checkout: Complete! — um pedido de valor zero foi concluído</w:t>
             </w:r>
           </w:p>
         </w:tc>
@@ -1615,7 +1263,700 @@
           <w:i w:val="0"/>
           <w:sz w:val="23"/>
         </w:rPr>
-        <w:t>[BUG-004] Layout quebrado na tela de produtos</w:t>
+        <w:t>[BUG-001] Campo de CEP aceita caracteres alfabéticos</w:t>
+      </w:r>
+    </w:p>
+    <w:tbl>
+      <w:tblPr>
+        <w:tblW w:type="auto" w:w="0"/>
+        <w:jc w:val="center"/>
+        <w:tblLook w:firstColumn="1" w:firstRow="1" w:lastColumn="0" w:lastRow="0" w:noHBand="0" w:noVBand="1" w:val="04A0"/>
+        <w:tblBorders>
+          <w:top w:val="single" w:sz="4" w:space="0" w:color="BFBFBF"/>
+          <w:left w:val="single" w:sz="4" w:space="0" w:color="BFBFBF"/>
+          <w:bottom w:val="single" w:sz="4" w:space="0" w:color="BFBFBF"/>
+          <w:right w:val="single" w:sz="4" w:space="0" w:color="BFBFBF"/>
+          <w:insideH w:val="single" w:sz="4" w:space="0" w:color="BFBFBF"/>
+          <w:insideV w:val="single" w:sz="4" w:space="0" w:color="BFBFBF"/>
+        </w:tblBorders>
+      </w:tblPr>
+      <w:tblGrid>
+        <w:gridCol w:w="4986"/>
+        <w:gridCol w:w="4986"/>
+      </w:tblGrid>
+      <w:tr>
+        <w:tc>
+          <w:tcPr>
+            <w:tcW w:type="dxa" w:w="2304"/>
+            <w:shd w:val="clear" w:color="auto" w:fill="E7E6E6"/>
+          </w:tcPr>
+          <w:p>
+            <w:r>
+              <w:rPr>
+                <w:rFonts w:ascii="Calibri" w:hAnsi="Calibri"/>
+                <w:b/>
+                <w:i w:val="0"/>
+                <w:sz w:val="20"/>
+              </w:rPr>
+              <w:t>Lista atual</w:t>
+            </w:r>
+          </w:p>
+        </w:tc>
+        <w:tc>
+          <w:tcPr>
+            <w:tcW w:type="dxa" w:w="6912"/>
+          </w:tcPr>
+          <w:p>
+            <w:r>
+              <w:rPr>
+                <w:rFonts w:ascii="Calibri" w:hAnsi="Calibri"/>
+                <w:b w:val="0"/>
+                <w:i w:val="0"/>
+                <w:sz w:val="20"/>
+              </w:rPr>
+              <w:t>Em Análise</w:t>
+            </w:r>
+          </w:p>
+        </w:tc>
+      </w:tr>
+      <w:tr>
+        <w:tc>
+          <w:tcPr>
+            <w:tcW w:type="dxa" w:w="2304"/>
+            <w:shd w:val="clear" w:color="auto" w:fill="E7E6E6"/>
+          </w:tcPr>
+          <w:p>
+            <w:r>
+              <w:rPr>
+                <w:rFonts w:ascii="Calibri" w:hAnsi="Calibri"/>
+                <w:b/>
+                <w:i w:val="0"/>
+                <w:sz w:val="20"/>
+              </w:rPr>
+              <w:t>Etiqueta Severidade</w:t>
+            </w:r>
+          </w:p>
+        </w:tc>
+        <w:tc>
+          <w:tcPr>
+            <w:tcW w:type="dxa" w:w="6912"/>
+          </w:tcPr>
+          <w:p>
+            <w:r>
+              <w:rPr>
+                <w:rFonts w:ascii="Calibri" w:hAnsi="Calibri"/>
+                <w:b w:val="0"/>
+                <w:i w:val="0"/>
+                <w:sz w:val="20"/>
+              </w:rPr>
+              <w:t>Amarelo (Média)</w:t>
+            </w:r>
+          </w:p>
+        </w:tc>
+      </w:tr>
+      <w:tr>
+        <w:tc>
+          <w:tcPr>
+            <w:tcW w:type="dxa" w:w="2304"/>
+            <w:shd w:val="clear" w:color="auto" w:fill="E7E6E6"/>
+          </w:tcPr>
+          <w:p>
+            <w:r>
+              <w:rPr>
+                <w:rFonts w:ascii="Calibri" w:hAnsi="Calibri"/>
+                <w:b/>
+                <w:i w:val="0"/>
+                <w:sz w:val="20"/>
+              </w:rPr>
+              <w:t>Etiqueta Prioridade</w:t>
+            </w:r>
+          </w:p>
+        </w:tc>
+        <w:tc>
+          <w:tcPr>
+            <w:tcW w:type="dxa" w:w="6912"/>
+          </w:tcPr>
+          <w:p>
+            <w:r>
+              <w:rPr>
+                <w:rFonts w:ascii="Calibri" w:hAnsi="Calibri"/>
+                <w:b w:val="0"/>
+                <w:i w:val="0"/>
+                <w:sz w:val="20"/>
+              </w:rPr>
+              <w:t>Azul (Média)</w:t>
+            </w:r>
+          </w:p>
+        </w:tc>
+      </w:tr>
+      <w:tr>
+        <w:tc>
+          <w:tcPr>
+            <w:tcW w:type="dxa" w:w="2304"/>
+            <w:shd w:val="clear" w:color="auto" w:fill="E7E6E6"/>
+          </w:tcPr>
+          <w:p>
+            <w:r>
+              <w:rPr>
+                <w:rFonts w:ascii="Calibri" w:hAnsi="Calibri"/>
+                <w:b/>
+                <w:i w:val="0"/>
+                <w:sz w:val="20"/>
+              </w:rPr>
+              <w:t>Ambiente</w:t>
+            </w:r>
+          </w:p>
+        </w:tc>
+        <w:tc>
+          <w:tcPr>
+            <w:tcW w:type="dxa" w:w="6912"/>
+          </w:tcPr>
+          <w:p>
+            <w:r>
+              <w:rPr>
+                <w:rFonts w:ascii="Calibri" w:hAnsi="Calibri"/>
+                <w:b w:val="0"/>
+                <w:i w:val="0"/>
+                <w:sz w:val="20"/>
+              </w:rPr>
+              <w:t>Sauce Demo / Google Chrome / Windows</w:t>
+            </w:r>
+          </w:p>
+        </w:tc>
+      </w:tr>
+      <w:tr>
+        <w:tc>
+          <w:tcPr>
+            <w:tcW w:type="dxa" w:w="2304"/>
+            <w:shd w:val="clear" w:color="auto" w:fill="E7E6E6"/>
+          </w:tcPr>
+          <w:p>
+            <w:r>
+              <w:rPr>
+                <w:rFonts w:ascii="Calibri" w:hAnsi="Calibri"/>
+                <w:b/>
+                <w:i w:val="0"/>
+                <w:sz w:val="20"/>
+              </w:rPr>
+              <w:t>Pré-condição</w:t>
+            </w:r>
+          </w:p>
+        </w:tc>
+        <w:tc>
+          <w:tcPr>
+            <w:tcW w:type="dxa" w:w="6912"/>
+          </w:tcPr>
+          <w:p>
+            <w:r>
+              <w:rPr>
+                <w:rFonts w:ascii="Calibri" w:hAnsi="Calibri"/>
+                <w:b w:val="0"/>
+                <w:i w:val="0"/>
+                <w:sz w:val="20"/>
+              </w:rPr>
+              <w:t>Usuário autenticado com standard_user; produto no carrinho; etapa de checkout aberta</w:t>
+            </w:r>
+          </w:p>
+        </w:tc>
+      </w:tr>
+      <w:tr>
+        <w:tc>
+          <w:tcPr>
+            <w:tcW w:type="dxa" w:w="2304"/>
+            <w:shd w:val="clear" w:color="auto" w:fill="E7E6E6"/>
+          </w:tcPr>
+          <w:p>
+            <w:r>
+              <w:rPr>
+                <w:rFonts w:ascii="Calibri" w:hAnsi="Calibri"/>
+                <w:b/>
+                <w:i w:val="0"/>
+                <w:sz w:val="20"/>
+              </w:rPr>
+              <w:t>Passos para Reprodução</w:t>
+            </w:r>
+          </w:p>
+        </w:tc>
+        <w:tc>
+          <w:tcPr>
+            <w:tcW w:type="dxa" w:w="6912"/>
+          </w:tcPr>
+          <w:p>
+            <w:r/>
+            <w:r>
+              <w:rPr>
+                <w:rFonts w:ascii="Calibri" w:hAnsi="Calibri"/>
+                <w:b w:val="0"/>
+                <w:i w:val="0"/>
+                <w:sz w:val="20"/>
+              </w:rPr>
+              <w:t>1. Adicionar um produto ao carrinho.</w:t>
+            </w:r>
+          </w:p>
+          <w:p>
+            <w:r>
+              <w:rPr>
+                <w:rFonts w:ascii="Calibri" w:hAnsi="Calibri"/>
+                <w:b w:val="0"/>
+                <w:i w:val="0"/>
+                <w:sz w:val="20"/>
+              </w:rPr>
+              <w:t>2. Abrir o carrinho e clicar em Checkout.</w:t>
+            </w:r>
+          </w:p>
+          <w:p>
+            <w:r>
+              <w:rPr>
+                <w:rFonts w:ascii="Calibri" w:hAnsi="Calibri"/>
+                <w:b w:val="0"/>
+                <w:i w:val="0"/>
+                <w:sz w:val="20"/>
+              </w:rPr>
+              <w:t>3. Preencher nome e sobrenome e digitar caracteres alfabéticos no campo de CEP (ex: ARARA).</w:t>
+            </w:r>
+          </w:p>
+          <w:p>
+            <w:r>
+              <w:rPr>
+                <w:rFonts w:ascii="Calibri" w:hAnsi="Calibri"/>
+                <w:b w:val="0"/>
+                <w:i w:val="0"/>
+                <w:sz w:val="20"/>
+              </w:rPr>
+              <w:t>4. Clicar em Continue.</w:t>
+            </w:r>
+          </w:p>
+        </w:tc>
+      </w:tr>
+      <w:tr>
+        <w:tc>
+          <w:tcPr>
+            <w:tcW w:type="dxa" w:w="2304"/>
+            <w:shd w:val="clear" w:color="auto" w:fill="E7E6E6"/>
+          </w:tcPr>
+          <w:p>
+            <w:r>
+              <w:rPr>
+                <w:rFonts w:ascii="Calibri" w:hAnsi="Calibri"/>
+                <w:b/>
+                <w:i w:val="0"/>
+                <w:sz w:val="20"/>
+              </w:rPr>
+              <w:t>Resultado Esperado</w:t>
+            </w:r>
+          </w:p>
+        </w:tc>
+        <w:tc>
+          <w:tcPr>
+            <w:tcW w:type="dxa" w:w="6912"/>
+          </w:tcPr>
+          <w:p>
+            <w:r>
+              <w:rPr>
+                <w:rFonts w:ascii="Calibri" w:hAnsi="Calibri"/>
+                <w:b w:val="0"/>
+                <w:i w:val="0"/>
+                <w:sz w:val="20"/>
+              </w:rPr>
+              <w:t>O sistema deveria rejeitar letras no CEP e informar que o valor é inválido</w:t>
+            </w:r>
+          </w:p>
+        </w:tc>
+      </w:tr>
+      <w:tr>
+        <w:tc>
+          <w:tcPr>
+            <w:tcW w:type="dxa" w:w="2304"/>
+            <w:shd w:val="clear" w:color="auto" w:fill="E7E6E6"/>
+          </w:tcPr>
+          <w:p>
+            <w:r>
+              <w:rPr>
+                <w:rFonts w:ascii="Calibri" w:hAnsi="Calibri"/>
+                <w:b/>
+                <w:i w:val="0"/>
+                <w:sz w:val="20"/>
+              </w:rPr>
+              <w:t>Resultado Obtido</w:t>
+            </w:r>
+          </w:p>
+        </w:tc>
+        <w:tc>
+          <w:tcPr>
+            <w:tcW w:type="dxa" w:w="6912"/>
+          </w:tcPr>
+          <w:p>
+            <w:r>
+              <w:rPr>
+                <w:rFonts w:ascii="Calibri" w:hAnsi="Calibri"/>
+                <w:b w:val="0"/>
+                <w:i w:val="0"/>
+                <w:sz w:val="20"/>
+              </w:rPr>
+              <w:t>O campo aceitou as letras e o fluxo seguiu para a tela Checkout: Overview, sem nenhuma mensagem de validação</w:t>
+            </w:r>
+          </w:p>
+        </w:tc>
+      </w:tr>
+    </w:tbl>
+    <w:p>
+      <w:pPr>
+        <w:spacing w:after="120"/>
+      </w:pPr>
+    </w:p>
+    <w:p>
+      <w:pPr>
+        <w:spacing w:before="200" w:after="80"/>
+      </w:pPr>
+      <w:r>
+        <w:rPr>
+          <w:rFonts w:ascii="Calibri" w:hAnsi="Calibri"/>
+          <w:b/>
+          <w:i w:val="0"/>
+          <w:sz w:val="23"/>
+        </w:rPr>
+        <w:t>[BUG-003] Todos os produtos exibem a mesma imagem (cachorro)</w:t>
+      </w:r>
+    </w:p>
+    <w:tbl>
+      <w:tblPr>
+        <w:tblW w:type="auto" w:w="0"/>
+        <w:jc w:val="center"/>
+        <w:tblLook w:firstColumn="1" w:firstRow="1" w:lastColumn="0" w:lastRow="0" w:noHBand="0" w:noVBand="1" w:val="04A0"/>
+        <w:tblBorders>
+          <w:top w:val="single" w:sz="4" w:space="0" w:color="BFBFBF"/>
+          <w:left w:val="single" w:sz="4" w:space="0" w:color="BFBFBF"/>
+          <w:bottom w:val="single" w:sz="4" w:space="0" w:color="BFBFBF"/>
+          <w:right w:val="single" w:sz="4" w:space="0" w:color="BFBFBF"/>
+          <w:insideH w:val="single" w:sz="4" w:space="0" w:color="BFBFBF"/>
+          <w:insideV w:val="single" w:sz="4" w:space="0" w:color="BFBFBF"/>
+        </w:tblBorders>
+      </w:tblPr>
+      <w:tblGrid>
+        <w:gridCol w:w="4986"/>
+        <w:gridCol w:w="4986"/>
+      </w:tblGrid>
+      <w:tr>
+        <w:tc>
+          <w:tcPr>
+            <w:tcW w:type="dxa" w:w="2304"/>
+            <w:shd w:val="clear" w:color="auto" w:fill="E7E6E6"/>
+          </w:tcPr>
+          <w:p>
+            <w:r>
+              <w:rPr>
+                <w:rFonts w:ascii="Calibri" w:hAnsi="Calibri"/>
+                <w:b/>
+                <w:i w:val="0"/>
+                <w:sz w:val="20"/>
+              </w:rPr>
+              <w:t>Lista atual</w:t>
+            </w:r>
+          </w:p>
+        </w:tc>
+        <w:tc>
+          <w:tcPr>
+            <w:tcW w:type="dxa" w:w="6912"/>
+          </w:tcPr>
+          <w:p>
+            <w:r>
+              <w:rPr>
+                <w:rFonts w:ascii="Calibri" w:hAnsi="Calibri"/>
+                <w:b w:val="0"/>
+                <w:i w:val="0"/>
+                <w:sz w:val="20"/>
+              </w:rPr>
+              <w:t>Em Análise</w:t>
+            </w:r>
+          </w:p>
+        </w:tc>
+      </w:tr>
+      <w:tr>
+        <w:tc>
+          <w:tcPr>
+            <w:tcW w:type="dxa" w:w="2304"/>
+            <w:shd w:val="clear" w:color="auto" w:fill="E7E6E6"/>
+          </w:tcPr>
+          <w:p>
+            <w:r>
+              <w:rPr>
+                <w:rFonts w:ascii="Calibri" w:hAnsi="Calibri"/>
+                <w:b/>
+                <w:i w:val="0"/>
+                <w:sz w:val="20"/>
+              </w:rPr>
+              <w:t>Etiqueta Severidade</w:t>
+            </w:r>
+          </w:p>
+        </w:tc>
+        <w:tc>
+          <w:tcPr>
+            <w:tcW w:type="dxa" w:w="6912"/>
+          </w:tcPr>
+          <w:p>
+            <w:r>
+              <w:rPr>
+                <w:rFonts w:ascii="Calibri" w:hAnsi="Calibri"/>
+                <w:b w:val="0"/>
+                <w:i w:val="0"/>
+                <w:sz w:val="20"/>
+              </w:rPr>
+              <w:t>Amarelo (Média)</w:t>
+            </w:r>
+          </w:p>
+        </w:tc>
+      </w:tr>
+      <w:tr>
+        <w:tc>
+          <w:tcPr>
+            <w:tcW w:type="dxa" w:w="2304"/>
+            <w:shd w:val="clear" w:color="auto" w:fill="E7E6E6"/>
+          </w:tcPr>
+          <w:p>
+            <w:r>
+              <w:rPr>
+                <w:rFonts w:ascii="Calibri" w:hAnsi="Calibri"/>
+                <w:b/>
+                <w:i w:val="0"/>
+                <w:sz w:val="20"/>
+              </w:rPr>
+              <w:t>Etiqueta Prioridade</w:t>
+            </w:r>
+          </w:p>
+        </w:tc>
+        <w:tc>
+          <w:tcPr>
+            <w:tcW w:type="dxa" w:w="6912"/>
+          </w:tcPr>
+          <w:p>
+            <w:r>
+              <w:rPr>
+                <w:rFonts w:ascii="Calibri" w:hAnsi="Calibri"/>
+                <w:b w:val="0"/>
+                <w:i w:val="0"/>
+                <w:sz w:val="20"/>
+              </w:rPr>
+              <w:t>Azul (Média)</w:t>
+            </w:r>
+          </w:p>
+        </w:tc>
+      </w:tr>
+      <w:tr>
+        <w:tc>
+          <w:tcPr>
+            <w:tcW w:type="dxa" w:w="2304"/>
+            <w:shd w:val="clear" w:color="auto" w:fill="E7E6E6"/>
+          </w:tcPr>
+          <w:p>
+            <w:r>
+              <w:rPr>
+                <w:rFonts w:ascii="Calibri" w:hAnsi="Calibri"/>
+                <w:b/>
+                <w:i w:val="0"/>
+                <w:sz w:val="20"/>
+              </w:rPr>
+              <w:t>Ambiente</w:t>
+            </w:r>
+          </w:p>
+        </w:tc>
+        <w:tc>
+          <w:tcPr>
+            <w:tcW w:type="dxa" w:w="6912"/>
+          </w:tcPr>
+          <w:p>
+            <w:r>
+              <w:rPr>
+                <w:rFonts w:ascii="Calibri" w:hAnsi="Calibri"/>
+                <w:b w:val="0"/>
+                <w:i w:val="0"/>
+                <w:sz w:val="20"/>
+              </w:rPr>
+              <w:t>Sauce Demo / Google Chrome / Windows</w:t>
+            </w:r>
+          </w:p>
+        </w:tc>
+      </w:tr>
+      <w:tr>
+        <w:tc>
+          <w:tcPr>
+            <w:tcW w:type="dxa" w:w="2304"/>
+            <w:shd w:val="clear" w:color="auto" w:fill="E7E6E6"/>
+          </w:tcPr>
+          <w:p>
+            <w:r>
+              <w:rPr>
+                <w:rFonts w:ascii="Calibri" w:hAnsi="Calibri"/>
+                <w:b/>
+                <w:i w:val="0"/>
+                <w:sz w:val="20"/>
+              </w:rPr>
+              <w:t>Pré-condição</w:t>
+            </w:r>
+          </w:p>
+        </w:tc>
+        <w:tc>
+          <w:tcPr>
+            <w:tcW w:type="dxa" w:w="6912"/>
+          </w:tcPr>
+          <w:p>
+            <w:r>
+              <w:rPr>
+                <w:rFonts w:ascii="Calibri" w:hAnsi="Calibri"/>
+                <w:b w:val="0"/>
+                <w:i w:val="0"/>
+                <w:sz w:val="20"/>
+              </w:rPr>
+              <w:t>Usuário autenticado com problem_user; página de produtos aberta</w:t>
+            </w:r>
+          </w:p>
+        </w:tc>
+      </w:tr>
+      <w:tr>
+        <w:tc>
+          <w:tcPr>
+            <w:tcW w:type="dxa" w:w="2304"/>
+            <w:shd w:val="clear" w:color="auto" w:fill="E7E6E6"/>
+          </w:tcPr>
+          <w:p>
+            <w:r>
+              <w:rPr>
+                <w:rFonts w:ascii="Calibri" w:hAnsi="Calibri"/>
+                <w:b/>
+                <w:i w:val="0"/>
+                <w:sz w:val="20"/>
+              </w:rPr>
+              <w:t>Passos para Reprodução</w:t>
+            </w:r>
+          </w:p>
+        </w:tc>
+        <w:tc>
+          <w:tcPr>
+            <w:tcW w:type="dxa" w:w="6912"/>
+          </w:tcPr>
+          <w:p>
+            <w:r/>
+            <w:r>
+              <w:rPr>
+                <w:rFonts w:ascii="Calibri" w:hAnsi="Calibri"/>
+                <w:b w:val="0"/>
+                <w:i w:val="0"/>
+                <w:sz w:val="20"/>
+              </w:rPr>
+              <w:t>1. Fazer login com problem_user.</w:t>
+            </w:r>
+          </w:p>
+          <w:p>
+            <w:r>
+              <w:rPr>
+                <w:rFonts w:ascii="Calibri" w:hAnsi="Calibri"/>
+                <w:b w:val="0"/>
+                <w:i w:val="0"/>
+                <w:sz w:val="20"/>
+              </w:rPr>
+              <w:t>2. Acessar a página de produtos.</w:t>
+            </w:r>
+          </w:p>
+          <w:p>
+            <w:r>
+              <w:rPr>
+                <w:rFonts w:ascii="Calibri" w:hAnsi="Calibri"/>
+                <w:b w:val="0"/>
+                <w:i w:val="0"/>
+                <w:sz w:val="20"/>
+              </w:rPr>
+              <w:t>3. Percorrer a listagem e comparar nome/descrição de cada produto com a imagem exibida.</w:t>
+            </w:r>
+          </w:p>
+        </w:tc>
+      </w:tr>
+      <w:tr>
+        <w:tc>
+          <w:tcPr>
+            <w:tcW w:type="dxa" w:w="2304"/>
+            <w:shd w:val="clear" w:color="auto" w:fill="E7E6E6"/>
+          </w:tcPr>
+          <w:p>
+            <w:r>
+              <w:rPr>
+                <w:rFonts w:ascii="Calibri" w:hAnsi="Calibri"/>
+                <w:b/>
+                <w:i w:val="0"/>
+                <w:sz w:val="20"/>
+              </w:rPr>
+              <w:t>Resultado Esperado</w:t>
+            </w:r>
+          </w:p>
+        </w:tc>
+        <w:tc>
+          <w:tcPr>
+            <w:tcW w:type="dxa" w:w="6912"/>
+          </w:tcPr>
+          <w:p>
+            <w:r>
+              <w:rPr>
+                <w:rFonts w:ascii="Calibri" w:hAnsi="Calibri"/>
+                <w:b w:val="0"/>
+                <w:i w:val="0"/>
+                <w:sz w:val="20"/>
+              </w:rPr>
+              <w:t>Cada produto deveria exibir uma imagem correspondente ao seu nome e à sua descrição</w:t>
+            </w:r>
+          </w:p>
+        </w:tc>
+      </w:tr>
+      <w:tr>
+        <w:tc>
+          <w:tcPr>
+            <w:tcW w:type="dxa" w:w="2304"/>
+            <w:shd w:val="clear" w:color="auto" w:fill="E7E6E6"/>
+          </w:tcPr>
+          <w:p>
+            <w:r>
+              <w:rPr>
+                <w:rFonts w:ascii="Calibri" w:hAnsi="Calibri"/>
+                <w:b/>
+                <w:i w:val="0"/>
+                <w:sz w:val="20"/>
+              </w:rPr>
+              <w:t>Resultado Obtido</w:t>
+            </w:r>
+          </w:p>
+        </w:tc>
+        <w:tc>
+          <w:tcPr>
+            <w:tcW w:type="dxa" w:w="6912"/>
+          </w:tcPr>
+          <w:p>
+            <w:r>
+              <w:rPr>
+                <w:rFonts w:ascii="Calibri" w:hAnsi="Calibri"/>
+                <w:b w:val="0"/>
+                <w:i w:val="0"/>
+                <w:sz w:val="20"/>
+              </w:rPr>
+              <w:t>Backpack, Bike Light, Bolt T-Shirt, Fleece Jacket e os demais itens aparecem com a mesma foto de um cachorro</w:t>
+            </w:r>
+          </w:p>
+        </w:tc>
+      </w:tr>
+    </w:tbl>
+    <w:p>
+      <w:pPr>
+        <w:spacing w:after="120"/>
+      </w:pPr>
+    </w:p>
+    <w:p>
+      <w:pPr>
+        <w:spacing w:before="200" w:after="80"/>
+      </w:pPr>
+      <w:r>
+        <w:rPr>
+          <w:rFonts w:ascii="Calibri" w:hAnsi="Calibri"/>
+          <w:b/>
+          <w:i w:val="0"/>
+          <w:sz w:val="23"/>
+        </w:rPr>
+        <w:t>[BUG-004] Descrição do produto não é exibida na página de detalhes</w:t>
       </w:r>
     </w:p>
     <w:tbl>
@@ -1771,7 +2112,7 @@
                 <w:i w:val="0"/>
                 <w:sz w:val="20"/>
               </w:rPr>
-              <w:t>Windows 11, Chrome 128</w:t>
+              <w:t>Sauce Demo / Google Chrome / Windows</w:t>
             </w:r>
           </w:p>
         </w:tc>
@@ -1806,7 +2147,7 @@
                 <w:i w:val="0"/>
                 <w:sz w:val="20"/>
               </w:rPr>
-              <w:t>Login com visual_user</w:t>
+              <w:t>Usuário autenticado com error_user; página de produtos aberta</w:t>
             </w:r>
           </w:p>
         </w:tc>
@@ -1842,7 +2183,7 @@
                 <w:i w:val="0"/>
                 <w:sz w:val="20"/>
               </w:rPr>
-              <w:t>1. Login com visual_user.</w:t>
+              <w:t>1. Fazer login com error_user e acessar a página de produtos.</w:t>
             </w:r>
           </w:p>
           <w:p>
@@ -1853,7 +2194,7 @@
                 <w:i w:val="0"/>
                 <w:sz w:val="20"/>
               </w:rPr>
-              <w:t>2. Entrar em Products.</w:t>
+              <w:t>2. Selecionar o produto Sauce Labs Backpack.</w:t>
             </w:r>
           </w:p>
           <w:p>
@@ -1864,7 +2205,7 @@
                 <w:i w:val="0"/>
                 <w:sz w:val="20"/>
               </w:rPr>
-              <w:t>3. Observar o alinhamento dos cards.</w:t>
+              <w:t>3. Observar as informações da página de detalhes.</w:t>
             </w:r>
           </w:p>
         </w:tc>
@@ -1899,7 +2240,7 @@
                 <w:i w:val="0"/>
                 <w:sz w:val="20"/>
               </w:rPr>
-              <w:t>Grid alinhado, igual ao standard_user</w:t>
+              <w:t>A página de detalhes deveria apresentar as informações do produto, incluindo a descrição</w:t>
             </w:r>
           </w:p>
         </w:tc>
@@ -1934,7 +2275,7 @@
                 <w:i w:val="0"/>
                 <w:sz w:val="20"/>
               </w:rPr>
-              <w:t>Imagens em tamanhos diferentes, sobrepondo texto e botão Add to cart</w:t>
+              <w:t>A página exibe o nome, o preço e o botão Add to cart, mas não apresenta a descrição</w:t>
             </w:r>
           </w:p>
         </w:tc>
@@ -1956,7 +2297,7 @@
           <w:i w:val="0"/>
           <w:sz w:val="23"/>
         </w:rPr>
-        <w:t>[BUG-005] Botão "Voltar" do navegador reexibe pedido já finalizado</w:t>
+        <w:t>[BUG-005] Preços, imagem e layout inconsistentes na listagem</w:t>
       </w:r>
     </w:p>
     <w:tbl>
@@ -2077,7 +2418,7 @@
                 <w:i w:val="0"/>
                 <w:sz w:val="20"/>
               </w:rPr>
-              <w:t>Cinza (Baixa)</w:t>
+              <w:t>Azul (Média)</w:t>
             </w:r>
           </w:p>
         </w:tc>
@@ -2112,7 +2453,7 @@
                 <w:i w:val="0"/>
                 <w:sz w:val="20"/>
               </w:rPr>
-              <w:t>Windows 11, Chrome 128</w:t>
+              <w:t>Sauce Demo / Google Chrome / Windows</w:t>
             </w:r>
           </w:p>
         </w:tc>
@@ -2147,7 +2488,7 @@
                 <w:i w:val="0"/>
                 <w:sz w:val="20"/>
               </w:rPr>
-              <w:t>Compra finalizada até Checkout: Complete!</w:t>
+              <w:t>Usuário autenticado com visual_user; página de produtos aberta</w:t>
             </w:r>
           </w:p>
         </w:tc>
@@ -2183,7 +2524,7 @@
                 <w:i w:val="0"/>
                 <w:sz w:val="20"/>
               </w:rPr>
-              <w:t>1. Finalizar compra até Checkout: Complete!.</w:t>
+              <w:t>1. Fazer login com visual_user.</w:t>
             </w:r>
           </w:p>
           <w:p>
@@ -2194,7 +2535,7 @@
                 <w:i w:val="0"/>
                 <w:sz w:val="20"/>
               </w:rPr>
-              <w:t>2. Clicar em Back Home.</w:t>
+              <w:t>2. Acessar a página de produtos.</w:t>
             </w:r>
           </w:p>
           <w:p>
@@ -2205,7 +2546,7 @@
                 <w:i w:val="0"/>
                 <w:sz w:val="20"/>
               </w:rPr>
-              <w:t>3. Clicar em Voltar no navegador.</w:t>
+              <w:t>3. Comparar preços, imagens e alinhamento com a listagem exibida para os outros usuários.</w:t>
             </w:r>
           </w:p>
         </w:tc>
@@ -2240,7 +2581,7 @@
                 <w:i w:val="0"/>
                 <w:sz w:val="20"/>
               </w:rPr>
-              <w:t>Não deveria reabrir a tela de pedido já concluído</w:t>
+              <w:t>Preços iguais aos do catálogo, imagem correta em cada produto e layout alinhado</w:t>
             </w:r>
           </w:p>
         </w:tc>
@@ -2275,348 +2616,7 @@
                 <w:i w:val="0"/>
                 <w:sz w:val="20"/>
               </w:rPr>
-              <w:t>Tela Checkout: Complete! é reexibida normalmente</w:t>
-            </w:r>
-          </w:p>
-        </w:tc>
-      </w:tr>
-    </w:tbl>
-    <w:p>
-      <w:pPr>
-        <w:spacing w:after="120"/>
-      </w:pPr>
-    </w:p>
-    <w:p>
-      <w:pPr>
-        <w:spacing w:before="200" w:after="80"/>
-      </w:pPr>
-      <w:r>
-        <w:rPr>
-          <w:rFonts w:ascii="Calibri" w:hAnsi="Calibri"/>
-          <w:b/>
-          <w:i w:val="0"/>
-          <w:sz w:val="23"/>
-        </w:rPr>
-        <w:t>[BUG-002] Ordenação "Name (Z to A)" não reordena a lista</w:t>
-      </w:r>
-    </w:p>
-    <w:tbl>
-      <w:tblPr>
-        <w:tblW w:type="auto" w:w="0"/>
-        <w:jc w:val="center"/>
-        <w:tblLook w:firstColumn="1" w:firstRow="1" w:lastColumn="0" w:lastRow="0" w:noHBand="0" w:noVBand="1" w:val="04A0"/>
-        <w:tblBorders>
-          <w:top w:val="single" w:sz="4" w:space="0" w:color="BFBFBF"/>
-          <w:left w:val="single" w:sz="4" w:space="0" w:color="BFBFBF"/>
-          <w:bottom w:val="single" w:sz="4" w:space="0" w:color="BFBFBF"/>
-          <w:right w:val="single" w:sz="4" w:space="0" w:color="BFBFBF"/>
-          <w:insideH w:val="single" w:sz="4" w:space="0" w:color="BFBFBF"/>
-          <w:insideV w:val="single" w:sz="4" w:space="0" w:color="BFBFBF"/>
-        </w:tblBorders>
-      </w:tblPr>
-      <w:tblGrid>
-        <w:gridCol w:w="4986"/>
-        <w:gridCol w:w="4986"/>
-      </w:tblGrid>
-      <w:tr>
-        <w:tc>
-          <w:tcPr>
-            <w:tcW w:type="dxa" w:w="2304"/>
-            <w:shd w:val="clear" w:color="auto" w:fill="E7E6E6"/>
-          </w:tcPr>
-          <w:p>
-            <w:r>
-              <w:rPr>
-                <w:rFonts w:ascii="Calibri" w:hAnsi="Calibri"/>
-                <w:b/>
-                <w:i w:val="0"/>
-                <w:sz w:val="20"/>
-              </w:rPr>
-              <w:t>Lista atual</w:t>
-            </w:r>
-          </w:p>
-        </w:tc>
-        <w:tc>
-          <w:tcPr>
-            <w:tcW w:type="dxa" w:w="6912"/>
-          </w:tcPr>
-          <w:p>
-            <w:r>
-              <w:rPr>
-                <w:rFonts w:ascii="Calibri" w:hAnsi="Calibri"/>
-                <w:b w:val="0"/>
-                <w:i w:val="0"/>
-                <w:sz w:val="20"/>
-              </w:rPr>
-              <w:t>Adiado</w:t>
-            </w:r>
-          </w:p>
-        </w:tc>
-      </w:tr>
-      <w:tr>
-        <w:tc>
-          <w:tcPr>
-            <w:tcW w:type="dxa" w:w="2304"/>
-            <w:shd w:val="clear" w:color="auto" w:fill="E7E6E6"/>
-          </w:tcPr>
-          <w:p>
-            <w:r>
-              <w:rPr>
-                <w:rFonts w:ascii="Calibri" w:hAnsi="Calibri"/>
-                <w:b/>
-                <w:i w:val="0"/>
-                <w:sz w:val="20"/>
-              </w:rPr>
-              <w:t>Etiqueta Severidade</w:t>
-            </w:r>
-          </w:p>
-        </w:tc>
-        <w:tc>
-          <w:tcPr>
-            <w:tcW w:type="dxa" w:w="6912"/>
-          </w:tcPr>
-          <w:p>
-            <w:r>
-              <w:rPr>
-                <w:rFonts w:ascii="Calibri" w:hAnsi="Calibri"/>
-                <w:b w:val="0"/>
-                <w:i w:val="0"/>
-                <w:sz w:val="20"/>
-              </w:rPr>
-              <w:t>Verde (Baixa)</w:t>
-            </w:r>
-          </w:p>
-        </w:tc>
-      </w:tr>
-      <w:tr>
-        <w:tc>
-          <w:tcPr>
-            <w:tcW w:type="dxa" w:w="2304"/>
-            <w:shd w:val="clear" w:color="auto" w:fill="E7E6E6"/>
-          </w:tcPr>
-          <w:p>
-            <w:r>
-              <w:rPr>
-                <w:rFonts w:ascii="Calibri" w:hAnsi="Calibri"/>
-                <w:b/>
-                <w:i w:val="0"/>
-                <w:sz w:val="20"/>
-              </w:rPr>
-              <w:t>Etiqueta Prioridade</w:t>
-            </w:r>
-          </w:p>
-        </w:tc>
-        <w:tc>
-          <w:tcPr>
-            <w:tcW w:type="dxa" w:w="6912"/>
-          </w:tcPr>
-          <w:p>
-            <w:r>
-              <w:rPr>
-                <w:rFonts w:ascii="Calibri" w:hAnsi="Calibri"/>
-                <w:b w:val="0"/>
-                <w:i w:val="0"/>
-                <w:sz w:val="20"/>
-              </w:rPr>
-              <w:t>Cinza (Baixa)</w:t>
-            </w:r>
-          </w:p>
-        </w:tc>
-      </w:tr>
-      <w:tr>
-        <w:tc>
-          <w:tcPr>
-            <w:tcW w:type="dxa" w:w="2304"/>
-            <w:shd w:val="clear" w:color="auto" w:fill="E7E6E6"/>
-          </w:tcPr>
-          <w:p>
-            <w:r>
-              <w:rPr>
-                <w:rFonts w:ascii="Calibri" w:hAnsi="Calibri"/>
-                <w:b/>
-                <w:i w:val="0"/>
-                <w:sz w:val="20"/>
-              </w:rPr>
-              <w:t>Ambiente</w:t>
-            </w:r>
-          </w:p>
-        </w:tc>
-        <w:tc>
-          <w:tcPr>
-            <w:tcW w:type="dxa" w:w="6912"/>
-          </w:tcPr>
-          <w:p>
-            <w:r>
-              <w:rPr>
-                <w:rFonts w:ascii="Calibri" w:hAnsi="Calibri"/>
-                <w:b w:val="0"/>
-                <w:i w:val="0"/>
-                <w:sz w:val="20"/>
-              </w:rPr>
-              <w:t>Windows 11, Chrome 128</w:t>
-            </w:r>
-          </w:p>
-        </w:tc>
-      </w:tr>
-      <w:tr>
-        <w:tc>
-          <w:tcPr>
-            <w:tcW w:type="dxa" w:w="2304"/>
-            <w:shd w:val="clear" w:color="auto" w:fill="E7E6E6"/>
-          </w:tcPr>
-          <w:p>
-            <w:r>
-              <w:rPr>
-                <w:rFonts w:ascii="Calibri" w:hAnsi="Calibri"/>
-                <w:b/>
-                <w:i w:val="0"/>
-                <w:sz w:val="20"/>
-              </w:rPr>
-              <w:t>Pré-condição</w:t>
-            </w:r>
-          </w:p>
-        </w:tc>
-        <w:tc>
-          <w:tcPr>
-            <w:tcW w:type="dxa" w:w="6912"/>
-          </w:tcPr>
-          <w:p>
-            <w:r>
-              <w:rPr>
-                <w:rFonts w:ascii="Calibri" w:hAnsi="Calibri"/>
-                <w:b w:val="0"/>
-                <w:i w:val="0"/>
-                <w:sz w:val="20"/>
-              </w:rPr>
-              <w:t>Login com problem_user, na tela Products</w:t>
-            </w:r>
-          </w:p>
-        </w:tc>
-      </w:tr>
-      <w:tr>
-        <w:tc>
-          <w:tcPr>
-            <w:tcW w:type="dxa" w:w="2304"/>
-            <w:shd w:val="clear" w:color="auto" w:fill="E7E6E6"/>
-          </w:tcPr>
-          <w:p>
-            <w:r>
-              <w:rPr>
-                <w:rFonts w:ascii="Calibri" w:hAnsi="Calibri"/>
-                <w:b/>
-                <w:i w:val="0"/>
-                <w:sz w:val="20"/>
-              </w:rPr>
-              <w:t>Passos para Reprodução</w:t>
-            </w:r>
-          </w:p>
-        </w:tc>
-        <w:tc>
-          <w:tcPr>
-            <w:tcW w:type="dxa" w:w="6912"/>
-          </w:tcPr>
-          <w:p>
-            <w:r/>
-            <w:r>
-              <w:rPr>
-                <w:rFonts w:ascii="Calibri" w:hAnsi="Calibri"/>
-                <w:b w:val="0"/>
-                <w:i w:val="0"/>
-                <w:sz w:val="20"/>
-              </w:rPr>
-              <w:t>1. Abrir o dropdown de ordenação.</w:t>
-            </w:r>
-          </w:p>
-          <w:p>
-            <w:r>
-              <w:rPr>
-                <w:rFonts w:ascii="Calibri" w:hAnsi="Calibri"/>
-                <w:b w:val="0"/>
-                <w:i w:val="0"/>
-                <w:sz w:val="20"/>
-              </w:rPr>
-              <w:t>2. Selecionar Name (Z to A).</w:t>
-            </w:r>
-          </w:p>
-          <w:p>
-            <w:r>
-              <w:rPr>
-                <w:rFonts w:ascii="Calibri" w:hAnsi="Calibri"/>
-                <w:b w:val="0"/>
-                <w:i w:val="0"/>
-                <w:sz w:val="20"/>
-              </w:rPr>
-              <w:t>3. Comparar a ordem antes/depois.</w:t>
-            </w:r>
-          </w:p>
-        </w:tc>
-      </w:tr>
-      <w:tr>
-        <w:tc>
-          <w:tcPr>
-            <w:tcW w:type="dxa" w:w="2304"/>
-            <w:shd w:val="clear" w:color="auto" w:fill="E7E6E6"/>
-          </w:tcPr>
-          <w:p>
-            <w:r>
-              <w:rPr>
-                <w:rFonts w:ascii="Calibri" w:hAnsi="Calibri"/>
-                <w:b/>
-                <w:i w:val="0"/>
-                <w:sz w:val="20"/>
-              </w:rPr>
-              <w:t>Resultado Esperado</w:t>
-            </w:r>
-          </w:p>
-        </w:tc>
-        <w:tc>
-          <w:tcPr>
-            <w:tcW w:type="dxa" w:w="6912"/>
-          </w:tcPr>
-          <w:p>
-            <w:r>
-              <w:rPr>
-                <w:rFonts w:ascii="Calibri" w:hAnsi="Calibri"/>
-                <w:b w:val="0"/>
-                <w:i w:val="0"/>
-                <w:sz w:val="20"/>
-              </w:rPr>
-              <w:t>Lista deveria reordenar de Z a A</w:t>
-            </w:r>
-          </w:p>
-        </w:tc>
-      </w:tr>
-      <w:tr>
-        <w:tc>
-          <w:tcPr>
-            <w:tcW w:type="dxa" w:w="2304"/>
-            <w:shd w:val="clear" w:color="auto" w:fill="E7E6E6"/>
-          </w:tcPr>
-          <w:p>
-            <w:r>
-              <w:rPr>
-                <w:rFonts w:ascii="Calibri" w:hAnsi="Calibri"/>
-                <w:b/>
-                <w:i w:val="0"/>
-                <w:sz w:val="20"/>
-              </w:rPr>
-              <w:t>Resultado Obtido</w:t>
-            </w:r>
-          </w:p>
-        </w:tc>
-        <w:tc>
-          <w:tcPr>
-            <w:tcW w:type="dxa" w:w="6912"/>
-          </w:tcPr>
-          <w:p>
-            <w:r>
-              <w:rPr>
-                <w:rFonts w:ascii="Calibri" w:hAnsi="Calibri"/>
-                <w:b w:val="0"/>
-                <w:i w:val="0"/>
-                <w:sz w:val="20"/>
-              </w:rPr>
-              <w:t>Lista continua igual, filtro não faz nada</w:t>
+              <w:t>Preços diferentes (Backpack $57.49, Bike Light $34.76, Bolt T-Shirt $87.58, Fleece Jacket $1.51); a Sauce Labs Backpack aparece com a imagem de um cachorro; o ícone do carrinho fica deslocado abaixo do cabeçalho e os títulos de Bolt T-Shirt e Fleece Jacket estão desalinhados</w:t>
             </w:r>
           </w:p>
         </w:tc>
@@ -3010,53 +3010,14 @@
         <w:rPr>
           <w:rFonts w:ascii="Calibri" w:hAnsi="Calibri"/>
           <w:b w:val="0"/>
-          <w:i w:val="0"/>
+          <w:i/>
           <w:sz w:val="21"/>
         </w:rPr>
-        <w:t>Print do board do Jira (betosilva.atlassian.net) com os 5 defeitos registrados, já com severidade, prioridade e coluna atribuídas conforme a triagem.</w:t>
-      </w:r>
-    </w:p>
-    <w:p>
-      <w:pPr>
-        <w:jc w:val="center"/>
-      </w:pPr>
-      <w:r>
-        <w:drawing>
-          <wp:inline xmlns:a="http://schemas.openxmlformats.org/drawingml/2006/main" xmlns:pic="http://schemas.openxmlformats.org/drawingml/2006/picture">
-            <wp:extent cx="5760720" cy="3315294"/>
-            <wp:docPr id="3" name="Picture 3"/>
-            <wp:cNvGraphicFramePr>
-              <a:graphicFrameLocks noChangeAspect="1"/>
-            </wp:cNvGraphicFramePr>
-            <a:graphic>
-              <a:graphicData uri="http://schemas.openxmlformats.org/drawingml/2006/picture">
-                <pic:pic>
-                  <pic:nvPicPr>
-                    <pic:cNvPr id="0" name="board-jira-5-bugs.png"/>
-                    <pic:cNvPicPr/>
-                  </pic:nvPicPr>
-                  <pic:blipFill>
-                    <a:blip r:embed="rId11"/>
-                    <a:stretch>
-                      <a:fillRect/>
-                    </a:stretch>
-                  </pic:blipFill>
-                  <pic:spPr>
-                    <a:xfrm>
-                      <a:off x="0" y="0"/>
-                      <a:ext cx="5760720" cy="3315294"/>
-                    </a:xfrm>
-                    <a:prstGeom prst="rect"/>
-                  </pic:spPr>
-                </pic:pic>
-              </a:graphicData>
-            </a:graphic>
-          </wp:inline>
-        </w:drawing>
+        <w:t>[print do board do Jira (betosilva.atlassian.net) com os 5 defeitos acima — atualizar os cartões existentes com o conteúdo desta versão antes de tirar o print]</w:t>
       </w:r>
     </w:p>
     <w:sectPr>
-      <w:footerReference w:type="default" r:id="rId12"/>
+      <w:footerReference w:type="default" r:id="rId11"/>
       <w:pgSz w:w="12240" w:h="15840"/>
       <w:pgMar w:top="850" w:right="1134" w:bottom="850" w:left="1134" w:header="720" w:footer="720" w:gutter="0"/>
       <w:cols w:space="720"/>

</xml_diff>